<commit_message>
docx: fit the diagrams to the page instead of only setting a width
add_picture was called with width=6.3in and nothing else, so the height scaled
with it. That is harmless for a landscape picture and ruinous for a tall one,
and these diagrams rank top to bottom: BeModelClinicalReport went in at 6.3 x
13.8 inches and ran off the end of the page, which is why the diagram in the
document looked nothing like the diagram in the file.

Pictures are now scaled to fit 6.3 x 8.2 inches, keeping their aspect ratio, so
the whole diagram lands on one page. BeModelClinicalReport is 3.7 x 8.2,
MedicationLine 6.3 x 7.6, the allergy model 6.3 x 6.9.

The trade shows on the tallest models: BeModelChildReport is 798x2253 pixels
and fits at 2.9 inches wide, which is on the page but small. The .svg beside
the document is the one to open for those.

Co-Authored-By: Claude Opus 5 <noreply@anthropic.com>
</commit_message>
<xml_diff>
--- a/exports/diagrams/BeModelAnnex81-en.docx
+++ b/exports/diagrams/BeModelAnnex81-en.docx
@@ -214,7 +214,7 @@
       <w:r>
         <w:drawing>
           <wp:inline xmlns:a="http://schemas.openxmlformats.org/drawingml/2006/main" xmlns:pic="http://schemas.openxmlformats.org/drawingml/2006/picture">
-            <wp:extent cx="5760720" cy="14608242"/>
+            <wp:extent cx="2956847" cy="7498080"/>
             <wp:docPr id="1" name="Picture 1"/>
             <wp:cNvGraphicFramePr>
               <a:graphicFrameLocks noChangeAspect="1"/>
@@ -235,7 +235,7 @@
                   <pic:spPr>
                     <a:xfrm>
                       <a:off x="0" y="0"/>
-                      <a:ext cx="5760720" cy="14608242"/>
+                      <a:ext cx="2956847" cy="7498080"/>
                     </a:xfrm>
                     <a:prstGeom prst="rect"/>
                   </pic:spPr>

</xml_diff>